<commit_message>
docs: add Canva defence-deck prompt + refresh Word doc technical sections
Hiver_Documentation.docx: update the drifted technical sections to current reality — 22 Alembic migrations (was 15), 16 tables, Row-Level Security, escrow via mock adapter (was 'Stripe Test Mode'), Supabase-hosted Postgres + in-app EventBus notifications (was 'self-hosted PG / Supabase Realtime'), React 19 + Vite 8 (was 18/5), 6 compose services incl. alertmanager, OOP Observer/EventBus emphasis, status through Phase 8. New docs/CANVA_DECK_PROMPT.md: paste-ready ~16-slide deck prompt with extra depth on OOP + DB.
</commit_message>
<xml_diff>
--- a/Hiver_Documentation.docx
+++ b/Hiver_Documentation.docx
@@ -46,7 +46,7 @@
         <w:rPr>
           <w:sz w:val="24"/>
         </w:rPr>
-        <w:t>Версия 3.0  |  2026</w:t>
+        <w:t>Версия 3.1  |  2026</w:t>
       </w:r>
     </w:p>
     <w:p>
@@ -1206,7 +1206,7 @@
           <w:b w:val="0"/>
           <w:i/>
         </w:rPr>
-        <w:t>Имплементация: статусна машина pending → held → released / refunded. Stripe Test Mode с manual capture. Виж секция 8 (База данни) за схемата на transactions.</w:t>
+        <w:t>Симулиран Escrow чрез mock payment adapter (payment_factory избира адаптера; лесно сменяем със Stripe). Статусна машина: pending → held → released / refunded; спор заключва escrow-а до решение.</w:t>
       </w:r>
     </w:p>
     <w:p>
@@ -2197,7 +2197,7 @@
           <w:b w:val="0"/>
           <w:i/>
         </w:rPr>
-        <w:t>Допълнително: State Machine (Task.status transitions), Value Object (Money, Location, Rating, WorkRadius), Context Manager (async with db_transaction), Builder (TaskFactory с verticalспецифични въпроси).</w:t>
+        <w:t>Ключови шаблони: Repository (Postgres* repos), Strategy + Adapter (IPaymentPort, IStoragePort, INotificationPort), Factory (payment_factory, storage_factory, TaskFactory) и Observer (EventBus за in-app нотификации). Допълнително: State Machine (Task.status), Value Object (Money, Location, Rating, WorkRadius), Context Manager (async with db_transaction), Builder (vertical-специфични task builders).</w:t>
       </w:r>
     </w:p>
     <w:p>
@@ -2331,7 +2331,7 @@
         <w:pStyle w:val="Heading2"/>
       </w:pPr>
       <w:r>
-        <w:t>8.1 Таблици (13)</w:t>
+        <w:t>8.1 Таблици (16)</w:t>
       </w:r>
     </w:p>
     <w:tbl>
@@ -2811,7 +2811,7 @@
         <w:pStyle w:val="Heading2"/>
       </w:pPr>
       <w:r>
-        <w:t>8.2 Миграции — 15 Alembic стъпки</w:t>
+        <w:t>8.2 Миграции — 22 Alembic стъпки</w:t>
       </w:r>
     </w:p>
     <w:p>
@@ -2820,7 +2820,7 @@
           <w:b w:val="0"/>
           <w:i w:val="0"/>
         </w:rPr>
-        <w:t>Цялата схема се изгражда чрез верига от 15 версионирани миграции (001 → 015). Това е изискване за грейдинг по БД.</w:t>
+        <w:t>Цялата схема се изгражда чрез верига от 22 версионирани миграции (001 → 022). Това е изискване за грейдинг по БД.</w:t>
       </w:r>
     </w:p>
     <w:tbl>
@@ -3373,7 +3373,7 @@
           <w:b w:val="0"/>
           <w:i w:val="0"/>
         </w:rPr>
-        <w:t>Схемата е 3NF. Документирани денормализации: avg_rating и completed_tasks в hivers (поддържани чрез тригер за production performance).</w:t>
+        <w:t>Схемата е 3NF. Документирани денормализации: avg_rating и completed_tasks в hivers (поддържани чрез тригер за production performance). Сигурност на ниво БД: Row-Level Security (default-deny, миграция 017) — Supabase auto-API не може да заобиколи бекенда.</w:t>
       </w:r>
     </w:p>
     <w:p>
@@ -3962,7 +3962,7 @@
           </w:tcPr>
           <w:p>
             <w:r>
-              <w:t>Stripe SDK ≥9.0</w:t>
+              <w:t>Stripe SDK ≥15 (опционален)</w:t>
             </w:r>
           </w:p>
         </w:tc>
@@ -3972,7 +3972,7 @@
           </w:tcPr>
           <w:p>
             <w:r>
-              <w:t>Manual-capture payment intents за escrow</w:t>
+              <w:t>Escrow по подразбиране чрез mock adapter; Stripe сменяем</w:t>
             </w:r>
           </w:p>
         </w:tc>
@@ -4154,7 +4154,7 @@
           </w:tcPr>
           <w:p>
             <w:r>
-              <w:t>React 18 + TypeScript 5 + Vite 5</w:t>
+              <w:t>React 19 + TypeScript 5 + Vite 8</w:t>
             </w:r>
           </w:p>
         </w:tc>
@@ -4282,7 +4282,7 @@
           </w:tcPr>
           <w:p>
             <w:r>
-              <w:t>Supabase Realtime</w:t>
+              <w:t>In-app EventBus + WebSocket</w:t>
             </w:r>
           </w:p>
         </w:tc>
@@ -4292,7 +4292,7 @@
           </w:tcPr>
           <w:p>
             <w:r>
-              <w:t>Push нотификации, live updates</w:t>
+              <w:t>In-app нотификации (Observer/EventBus) + WebSocket чат</w:t>
             </w:r>
           </w:p>
         </w:tc>
@@ -4464,7 +4464,7 @@
           <w:b w:val="0"/>
           <w:i/>
         </w:rPr>
-        <w:t>Защо PostgreSQL, а не Supabase като главна БД: Supabase се ползва само за Storage (снимки) и Realtime (нотификации). Главната БД е self-hosted PostgreSQL, защото: (1) PostGIS е нужен за геопространствени заявки, (2) пълен SQL контрол за PL/pgSQL тригери, stored procedures и window-function views, (3) Alembic миграции са изискване за грейдинг — Supabase не поддържа Alembic.</w:t>
+        <w:t>Защо PostgreSQL (хостван на Supabase): главната БД е PostgreSQL, хостван на Supabase като managed Postgres (през pgbouncer transaction pooler). Supabase е само managed Postgres хост + Storage за снимки — не ползваме auto-генерираното data API (заключено с Row-Level Security). Нотификациите са in-app чрез EventBus (Observer), а чатът — през WebSocket; не In-app EventBus + WebSocket. PostgreSQL е избран заради PostGIS геозаявки, пълен SQL контрол (PL/pgSQL тригери, stored functions, window-function views) и Alembic миграции.</w:t>
       </w:r>
     </w:p>
     <w:p>
@@ -4489,7 +4489,7 @@
           <w:b w:val="0"/>
           <w:i w:val="0"/>
         </w:rPr>
-        <w:t>Текуща имплементация: React 18 + TypeScript 5 + Vite 5 + CSS Modules. Hot Module Reload за бърза разработка. ESM-first build за production.</w:t>
+        <w:t>Текуща имплементация: React 19 + TypeScript 5 + Vite 8 + CSS Modules. Hot Module Reload за бърза разработка. ESM-first build за production. Карти и адресно автодовършване през Google Maps + Places, с keyless OpenStreetMap fallback.</w:t>
       </w:r>
     </w:p>
     <w:tbl>
@@ -4855,7 +4855,7 @@
           <w:b w:val="0"/>
           <w:i w:val="0"/>
         </w:rPr>
-        <w:t>docker-compose.yml оркестрира 5 сървиса локално: backend, postgres (PostGIS), redis, prometheus, grafana.</w:t>
+        <w:t>docker-compose.yml оркестрира 6 сървиса локално: backend, postgres (PostGIS), redis, prometheus, alertmanager, grafana.</w:t>
       </w:r>
     </w:p>
     <w:p>
@@ -5623,7 +5623,7 @@
           <w:b/>
           <w:i w:val="0"/>
         </w:rPr>
-        <w:t>Към 29 май 2026 г.:</w:t>
+        <w:t>Към юни 2026 г. — завършени са Фази 1–7 (пълен marketplace) и Фаза 8 е в ход (Docker/K8s/CI-CD/мониторинг; scaffold за деплой). По-долу е акцент от ранната разработка:</w:t>
       </w:r>
     </w:p>
     <w:tbl>
@@ -5797,7 +5797,7 @@
           </w:tcPr>
           <w:p>
             <w:r>
-              <w:t>Database — 13 модела, 15 Alembic миграции, тригери, PostGIS функция, view, seed</w:t>
+              <w:t>Database — 16+ модела, 22 Alembic миграции, тригери, PostGIS функция, view, RLS, seed</w:t>
             </w:r>
           </w:p>
         </w:tc>
@@ -5913,7 +5913,7 @@
           <w:b/>
           <w:i w:val="0"/>
         </w:rPr>
-        <w:t>Изградено в Фаза 4 (до момента):</w:t>
+        <w:t>Акцент от ранната разработка (Фаза 4):</w:t>
       </w:r>
     </w:p>
     <w:p>
@@ -7358,7 +7358,7 @@
           </w:tcPr>
           <w:p>
             <w:r>
-              <w:t>Много силно — 15 миграции, 3 тригера, PostGIS stored function, window-function view</w:t>
+              <w:t>Много силно — 22 миграции, 3 тригера, PostGIS stored function, window-function view, RLS</w:t>
             </w:r>
           </w:p>
         </w:tc>

</xml_diff>